<commit_message>
prepare for two new front end features
</commit_message>
<xml_diff>
--- a/docs/PROJECT_STRUCTURE-listmgr.docx
+++ b/docs/PROJECT_STRUCTURE-listmgr.docx
@@ -5,21 +5,45 @@
     <w:p>
       <w:pPr>
         <w:pStyle w:val="Heading1"/>
+        <w:rPr>
+          <w:sz w:val="32"/>
+          <w:szCs w:val="32"/>
+        </w:rPr>
       </w:pPr>
       <w:bookmarkStart w:id="0" w:name="X42a90355af2a47a7ad64a592352d39f82507288"/>
       <w:r>
+        <w:rPr>
+          <w:sz w:val="32"/>
+          <w:szCs w:val="32"/>
+        </w:rPr>
         <w:t xml:space="preserve">Project Structure - </w:t>
       </w:r>
       <w:r>
+        <w:rPr>
+          <w:sz w:val="32"/>
+          <w:szCs w:val="32"/>
+        </w:rPr>
         <w:t>l</w:t>
       </w:r>
       <w:r>
+        <w:rPr>
+          <w:sz w:val="32"/>
+          <w:szCs w:val="32"/>
+        </w:rPr>
         <w:t>ist</w:t>
       </w:r>
       <w:r>
+        <w:rPr>
+          <w:sz w:val="32"/>
+          <w:szCs w:val="32"/>
+        </w:rPr>
         <w:t>m</w:t>
       </w:r>
       <w:r>
+        <w:rPr>
+          <w:sz w:val="32"/>
+          <w:szCs w:val="32"/>
+        </w:rPr>
         <w:t>gr1 (Sales Quote Template Manager)</w:t>
       </w:r>
     </w:p>
@@ -200,7 +224,7 @@
         <w:rPr>
           <w:noProof/>
         </w:rPr>
-        <w:pict w14:anchorId="4AFFCD3C">
+        <w:pict w14:anchorId="760B356B">
           <v:rect id="_x0000_i1025" alt="" style="width:468pt;height:.05pt;mso-width-percent:0;mso-height-percent:0;mso-width-percent:0;mso-height-percent:0" o:hralign="center" o:hrstd="t" o:hr="t"/>
         </w:pict>
       </w:r>
@@ -466,34 +490,34 @@
         <w:rPr>
           <w:rStyle w:val="VerbatimChar"/>
         </w:rPr>
+        <w:t>│   ├── routes/</w:t>
+      </w:r>
+      <w:r>
+        <w:br/>
+      </w:r>
+      <w:r>
+        <w:rPr>
+          <w:rStyle w:val="VerbatimChar"/>
+        </w:rPr>
+        <w:t>│   │   ├── appSettings.js         # GET/PUT app settings</w:t>
+      </w:r>
+      <w:r>
+        <w:br/>
+      </w:r>
+      <w:r>
+        <w:rPr>
+          <w:rStyle w:val="VerbatimChar"/>
+        </w:rPr>
+        <w:t>│   │   ├── auth.js                # Login, logout, session check</w:t>
+      </w:r>
+      <w:r>
+        <w:br/>
+      </w:r>
+      <w:r>
+        <w:rPr>
+          <w:rStyle w:val="VerbatimChar"/>
+        </w:rPr>
         <w:lastRenderedPageBreak/>
-        <w:t>│   ├── routes/</w:t>
-      </w:r>
-      <w:r>
-        <w:br/>
-      </w:r>
-      <w:r>
-        <w:rPr>
-          <w:rStyle w:val="VerbatimChar"/>
-        </w:rPr>
-        <w:t>│   │   ├── appSettings.js         # GET/PUT app settings</w:t>
-      </w:r>
-      <w:r>
-        <w:br/>
-      </w:r>
-      <w:r>
-        <w:rPr>
-          <w:rStyle w:val="VerbatimChar"/>
-        </w:rPr>
-        <w:t>│   │   ├── auth.js                # Login, logout, session check</w:t>
-      </w:r>
-      <w:r>
-        <w:br/>
-      </w:r>
-      <w:r>
-        <w:rPr>
-          <w:rStyle w:val="VerbatimChar"/>
-        </w:rPr>
         <w:t>│   │   ├── countries.js           # CRUD for countries</w:t>
       </w:r>
       <w:r>
@@ -908,34 +932,34 @@
         <w:rPr>
           <w:rStyle w:val="VerbatimChar"/>
         </w:rPr>
+        <w:t>│       │   ├── ProductCategories.jsx # Product category management</w:t>
+      </w:r>
+      <w:r>
+        <w:br/>
+      </w:r>
+      <w:r>
+        <w:rPr>
+          <w:rStyle w:val="VerbatimChar"/>
+        </w:rPr>
+        <w:t>│       │   ├── ProductLines.jsx    # Product line management</w:t>
+      </w:r>
+      <w:r>
+        <w:br/>
+      </w:r>
+      <w:r>
+        <w:rPr>
+          <w:rStyle w:val="VerbatimChar"/>
+        </w:rPr>
+        <w:t>│       │   ├── SectionTypes.jsx    # Section type management</w:t>
+      </w:r>
+      <w:r>
+        <w:br/>
+      </w:r>
+      <w:r>
+        <w:rPr>
+          <w:rStyle w:val="VerbatimChar"/>
+        </w:rPr>
         <w:lastRenderedPageBreak/>
-        <w:t>│       │   ├── ProductCategories.jsx # Product category management</w:t>
-      </w:r>
-      <w:r>
-        <w:br/>
-      </w:r>
-      <w:r>
-        <w:rPr>
-          <w:rStyle w:val="VerbatimChar"/>
-        </w:rPr>
-        <w:t>│       │   ├── ProductLines.jsx    # Product line management</w:t>
-      </w:r>
-      <w:r>
-        <w:br/>
-      </w:r>
-      <w:r>
-        <w:rPr>
-          <w:rStyle w:val="VerbatimChar"/>
-        </w:rPr>
-        <w:t>│       │   ├── SectionTypes.jsx    # Section type management</w:t>
-      </w:r>
-      <w:r>
-        <w:br/>
-      </w:r>
-      <w:r>
-        <w:rPr>
-          <w:rStyle w:val="VerbatimChar"/>
-        </w:rPr>
         <w:t>│       │   ├── Settings.jsx        # App settings page</w:t>
       </w:r>
       <w:r>

</xml_diff>